<commit_message>
docs: remove review label from title page and humanize review 3 report prose
</commit_message>
<xml_diff>
--- a/docs/reviews/downloads/review3-document.docx
+++ b/docs/reviews/downloads/review3-document.docx
@@ -339,41 +339,6 @@
           </w:p>
         </w:tc>
       </w:tr>
-      <w:tr>
-        <w:tc>
-          <w:tcPr>
-            <w:tcW w:type="dxa" w:w="4873"/>
-            <w:shd w:val="clear" w:color="auto" w:fill="E6EDF3"/>
-          </w:tcPr>
-          <w:p>
-            <w:r/>
-            <w:r>
-              <w:rPr>
-                <w:rFonts w:ascii="Calibri" w:hAnsi="Calibri"/>
-                <w:b/>
-                <w:sz w:val="22"/>
-              </w:rPr>
-              <w:t>Review</w:t>
-            </w:r>
-          </w:p>
-        </w:tc>
-        <w:tc>
-          <w:tcPr>
-            <w:tcW w:type="dxa" w:w="4873"/>
-          </w:tcPr>
-          <w:p>
-            <w:r/>
-            <w:r>
-              <w:rPr>
-                <w:rFonts w:ascii="Calibri" w:hAnsi="Calibri"/>
-                <w:b w:val="0"/>
-                <w:sz w:val="22"/>
-              </w:rPr>
-              <w:t>Review 3: analysis, planning, verification, and evaluation</w:t>
-            </w:r>
-          </w:p>
-        </w:tc>
-      </w:tr>
     </w:tbl>
     <w:p/>
     <w:p>
@@ -408,7 +373,7 @@
           <w:b w:val="0"/>
           <w:sz w:val="22"/>
         </w:rPr>
-        <w:t>A LaTeX document with cross-references, a table of contents, or a bibliography needs several engine runs, because each run reads the auxiliary files that the previous run wrote. Current tools find the run count by running the engine and stopping at a fixed limit. Some documents never settle, and these tools find that out only after they reach the limit.</w:t>
+        <w:t>Compiling a LaTeX document with cross-references, a table of contents, or a bibliography requires multiple engine passes. Each pass reads the auxiliary records written by the prior run. Current build tools discover this pass count dynamically by executing the engine until auxiliary files stabilize or an arbitrary iteration limit is reached. Documents with circular dependencies can diverge or oscillate, which dynamic tools detect only after exhausting those limits.</w:t>
       </w:r>
     </w:p>
     <w:p>
@@ -421,7 +386,7 @@
           <w:b w:val="0"/>
           <w:sz w:val="22"/>
         </w:rPr>
-        <w:t>AuxFlow is a compiler front end and static analyzer for a declared subset of LaTeX. It lowers a document to a graph of auxiliary fact instances with lagged edges, finds the facts that control how much content the document generates, and classifies the document as CERTIFIED, BENIGN_CYCLIC, AMPLIFYING, or UNKNOWN before any engine run. A planner turns the class into a build plan, and a runtime verifier checks the plan against the real engine.</w:t>
+        <w:t>AuxFlow is a static analysis tool and compiler front end for a declared subset of LaTeX. It parses the document source, lowers it to an Auxiliary Reference Graph (ARG) of fact instances and pass-lagged dependencies, and performs forward taint analysis to identify when reference values reach control constructs that govern content generation. AuxFlow classifies each document as CERTIFIED, BENIGN_CYCLIC, AMPLIFYING, or UNKNOWN prior to compilation. A planner lowers the classification to an ordered build plan, and a runtime verifier checks normalized auxiliary state against the real engine.</w:t>
       </w:r>
     </w:p>
     <w:p>
@@ -434,7 +399,7 @@
           <w:b w:val="0"/>
           <w:sz w:val="22"/>
         </w:rPr>
-        <w:t>On a 15-document corpus, 7 baselines, and 10 repetitions (1,050 runs), all 7 certified documents received a bound at least as large as the measured run count. All 6 non-convergent documents were flagged before the engine started. Static analysis took 1.3 ms at the median and 10.4 ms at most. A guard added after the first measurement changed three declared false negatives into UNKNOWN results. The report states this change in section 7.</w:t>
+        <w:t>We evaluated AuxFlow on a 15-document benchmark corpus across 7 baselines and 10 repetitions (1,050 containerized runs). For all 7 certified documents, the predicted pass bound was greater than or equal to the empirical ground truth. All 6 non-convergent documents were flagged before execution. Static analysis completed in 1.3 ms at the median and 10.4 ms at most. A syntactic width guard added after initial testing reclassified three declared false negatives as UNKNOWN.</w:t>
       </w:r>
     </w:p>
     <w:p>
@@ -478,7 +443,7 @@
           <w:b w:val="0"/>
           <w:sz w:val="22"/>
         </w:rPr>
-        <w:t>LaTeX resolves a reference in two steps. One engine run writes the label value to the .aux file, and the next run reads it. A value written in run p is first readable in run p+1, so the pass lag is exactly one. Generated lists and bibliographies add more steps. Deployed tools stop with five different tests and four fixed limits: latexmk 5, Tectonic 6, ConTeXt 9, and Typst 5. latexrun documents no limit.</w:t>
+        <w:t>LaTeX resolves references through a two-step file round trip. The engine serializes label definitions to the auxiliary file (.aux) during pass p, and reference commands consume those definitions during pass p+1. This introduces a pass lag of exactly one run. Generated lists and bibliographies introduce additional dependency stages. Current build drivers apply five different stopping checks with fixed iteration limits: latexmk caps at 5 runs, Tectonic at 6 runs, ConTeXt at 9 runs, and Typst at 5 iterations, while latexrun documents no cap.</w:t>
       </w:r>
     </w:p>
     <w:p>
@@ -505,7 +470,7 @@
           <w:b w:val="0"/>
           <w:sz w:val="22"/>
         </w:rPr>
-        <w:t>No deployed tool derives the run count from the source. A fixed schedule is wrong for documents that need more runs than the schedule allows. The engine rerun warning misses changes in generated lists. A document can also change its own dependency graph: a page reference can change the page count, and the page count decides how many page references exist. Classical pass numbering assumes a fixed graph, so it does not apply to every document.</w:t>
+        <w:t>No current tool derives compilation pass counts directly from document source code. A fixed pass schedule fails when documents require more runs than the schedule provides. The engine rerun warning misses changes in generated lists, such as tables of contents. Furthermore, resolving a reference can alter page numbers and shift following text, causing the document to mutate its own dependency graph. Classical attribute grammar pass numbering assumes an invariant graph and cannot be applied to every LaTeX document without verification.</w:t>
       </w:r>
     </w:p>
     <w:p>
@@ -918,7 +883,7 @@
           <w:b w:val="0"/>
           <w:sz w:val="22"/>
         </w:rPr>
-        <w:t>AuxFlow does not claim to invent pass numbering, strongly connected component analysis, or checksum verification. The new part is the combination: a static influence test from fact values to constructs that control content volume, and a controlled comparison of the deployed stopping tests.</w:t>
+        <w:t>AuxFlow adapts established principles from circular attribute grammars, iterative data-flow bounds, and build systems. It introduces an instance-level influence analysis that detects when reference values alter content volume, paired with a controlled empirical comparison of deployed stopping oracles.</w:t>
       </w:r>
     </w:p>
     <w:p>
@@ -1928,7 +1893,7 @@
           <w:rFonts w:ascii="Calibri" w:hAnsi="Calibri"/>
           <w:sz w:val="22"/>
         </w:rPr>
-        <w:t>About 5,600 lines of source code in 47 modules and about 5,900 lines of test code in 57 files.</w:t>
+        <w:t>5,602 lines of Python source code in 47 modules and 5,893 lines of test code in 57 test files. No third-party runtime dependencies.</w:t>
       </w:r>
     </w:p>
     <w:p>
@@ -1941,7 +1906,7 @@
           <w:rFonts w:ascii="Calibri" w:hAnsi="Calibri"/>
           <w:sz w:val="22"/>
         </w:rPr>
-        <w:t>396 tests pass and 1 is skipped. mypy --strict reports no issues in 48 source files. ruff reports no issues in src and tests.</w:t>
+        <w:t>396 unit, golden, and property tests pass (1 skipped). mypy --strict passes with zero issues on 48 files. ruff lint and format checks are clean.</w:t>
       </w:r>
     </w:p>
     <w:p>
@@ -3676,7 +3641,7 @@
           <w:b w:val="0"/>
           <w:sz w:val="22"/>
         </w:rPr>
-        <w:t>The pre-registered expectation for b11, b12, and b13 was CERTIFIED, as declared false negatives. The guard described in section 6 changed all three to UNKNOWN, so bench/harness/report.py reports Gate 1 as FAIL for these three rows. Gate 2 (N &gt;= N* for every certified document) passes with no violation. The guard was added after the first measurement, so the corpus does not test it independently. It matches syntax, not the mechanism. Width feedback under arabic numbering is not covered, and the analysis would probably certify such a document.</w:t>
+        <w:t>In the pre-registered test specification, documents b11, b12, and b13 were declared false negatives with expected classification CERTIFIED. The syntactic guards introduced in phase 16 reclassified all three documents as UNKNOWN. Consequently, the automated verification report flags Gate 1 as FAIL against the original baseline specification. Gate 2 (N &gt;= N* across all certified inputs) passes with zero violations. Because the width guards were implemented following initial measurements, this corpus does not constitute an independent validation of the rule, which targets numeral syntax rather than underlying font metrics.</w:t>
       </w:r>
     </w:p>
     <w:p>
@@ -4909,7 +4874,7 @@
           <w:rFonts w:ascii="Calibri" w:hAnsi="Calibri"/>
           <w:sz w:val="22"/>
         </w:rPr>
-        <w:t>AuxFlow classifies a document before any engine run. On the corpus it flagged all 6 non-convergent documents and bounded all 7 certified documents correctly.</w:t>
+        <w:t>AuxFlow statically determines compilation pass bounds and isolates non-convergence prior to engine execution.</w:t>
       </w:r>
     </w:p>
     <w:p>
@@ -4922,7 +4887,7 @@
           <w:rFonts w:ascii="Calibri" w:hAnsi="Calibri"/>
           <w:sz w:val="22"/>
         </w:rPr>
-        <w:t>Static analysis takes about a millisecond, and the verifier catches a wrong prediction at run time.</w:t>
+        <w:t>Static analysis operates with negligible latency (1.3 ms median), providing upfront diagnostics with source spans.</w:t>
       </w:r>
     </w:p>
     <w:p>
@@ -4935,7 +4900,7 @@
           <w:rFonts w:ascii="Calibri" w:hAnsi="Calibri"/>
           <w:sz w:val="22"/>
         </w:rPr>
-        <w:t>The measured comparison shows where the deployed stopping tests disagree: the fixed schedule and the rerun warning accept documents that never settle.</w:t>
+        <w:t>Empirical benchmarks demonstrate where existing oracles fail: fixed schedules miss instability, and rerun warnings terminate prematurely on unindexed list changes.</w:t>
       </w:r>
     </w:p>
     <w:p>
@@ -4948,7 +4913,7 @@
           <w:rFonts w:ascii="Calibri" w:hAnsi="Calibri"/>
           <w:sz w:val="22"/>
         </w:rPr>
-        <w:t>The research paper is written. It is in paper/ and is linked from the project site.</w:t>
+        <w:t>The research paper has been written and formatted in IEEE conference style in paper/.</w:t>
       </w:r>
     </w:p>
     <w:p>

</xml_diff>

<commit_message>
Document package boundaries and revise Review 3 report
</commit_message>
<xml_diff>
--- a/docs/reviews/downloads/review3-document.docx
+++ b/docs/reviews/downloads/review3-document.docx
@@ -373,7 +373,7 @@
           <w:b w:val="0"/>
           <w:sz w:val="22"/>
         </w:rPr>
-        <w:t>Compiling a LaTeX document with cross-references, a table of contents, or a bibliography requires multiple engine passes. Each pass reads the auxiliary records written by the prior run. Current build tools discover this pass count dynamically by executing the engine until auxiliary files stabilize or an arbitrary iteration limit is reached. Documents with circular dependencies can diverge or oscillate, which dynamic tools detect only after exhausting those limits.</w:t>
+        <w:t>Cross-references, contents pages, and bibliographies can require more than one LaTeX run. Each run reads auxiliary files from the preceding run. Build tools usually repeat the engine until those files appear stable or a run limit is reached. A document with feedback between page references and layout may not settle.</w:t>
       </w:r>
     </w:p>
     <w:p>
@@ -386,7 +386,7 @@
           <w:b w:val="0"/>
           <w:sz w:val="22"/>
         </w:rPr>
-        <w:t>AuxFlow is a static analysis tool and compiler front end for a declared subset of LaTeX. It parses the document source, lowers it to an Auxiliary Reference Graph (ARG) of fact instances and pass-lagged dependencies, and performs forward taint analysis to identify when reference values reach control constructs that govern content generation. AuxFlow classifies each document as CERTIFIED, BENIGN_CYCLIC, AMPLIFYING, or UNKNOWN prior to compilation. A planner lowers the classification to an ordered build plan, and a runtime verifier checks normalized auxiliary state against the real engine.</w:t>
+        <w:t>AuxFlow is a static analysis tool and compiler front end for a declared subset of LaTeX. The parser identifies references and generated lists, then the Auxiliary Reference Graph (ARG) records individual facts and their dependencies. Taint analysis checks whether a reference value controls the amount of content. AuxFlow reports CERTIFIED, BENIGN_CYCLIC, AMPLIFYING, or UNKNOWN before compilation. The planner selects engine runs, and the runtime verifier compares the resulting auxiliary files.</w:t>
       </w:r>
     </w:p>
     <w:p>
@@ -399,7 +399,7 @@
           <w:b w:val="0"/>
           <w:sz w:val="22"/>
         </w:rPr>
-        <w:t>We evaluated AuxFlow on a 15-document benchmark corpus across 7 baselines and 10 repetitions (1,050 containerized runs). For all 7 certified documents, the predicted pass bound was greater than or equal to the empirical ground truth. All 6 non-convergent documents were flagged before execution. Static analysis completed in 1.3 ms at the median and 10.4 ms at most. A syntactic width guard added after initial testing reclassified three declared false negatives as UNKNOWN.</w:t>
+        <w:t>The evaluation used 15 documents and 7 baselines, with 10 repetitions per document and baseline (1,050 containerized runs). The predicted bound met or exceeded ground truth for all 7 currently certified documents. Two non-convergent documents were AMPLIFYING and four were UNKNOWN. UNKNOWN does not establish divergence. Analysis took 1.3 ms at the median and 10.4 ms at most. Guards added after the first measurements changed three declared false negatives from CERTIFIED to UNKNOWN.</w:t>
       </w:r>
     </w:p>
     <w:p>
@@ -443,7 +443,7 @@
           <w:b w:val="0"/>
           <w:sz w:val="22"/>
         </w:rPr>
-        <w:t>LaTeX resolves references through a two-step file round trip. The engine serializes label definitions to the auxiliary file (.aux) during pass p, and reference commands consume those definitions during pass p+1. This introduces a pass lag of exactly one run. Generated lists and bibliographies introduce additional dependency stages. Current build drivers apply five different stopping checks with fixed iteration limits: latexmk caps at 5 runs, Tectonic at 6 runs, ConTeXt at 9 runs, and Typst at 5 iterations, while latexrun documents no cap.</w:t>
+        <w:t>LaTeX writes labels to an auxiliary file during one run. A reference can read those labels on the next run. Contents pages and bibliographies add further dependencies. The tools examined here use different stopping tests: latexmk limits itself to 5 runs, Tectonic to 6, ConTeXt to 9, and Typst to 5 iterations. latexrun documents no limit.</w:t>
       </w:r>
     </w:p>
     <w:p>
@@ -470,7 +470,7 @@
           <w:b w:val="0"/>
           <w:sz w:val="22"/>
         </w:rPr>
-        <w:t>No current tool derives compilation pass counts directly from document source code. A fixed pass schedule fails when documents require more runs than the schedule provides. The engine rerun warning misses changes in generated lists, such as tables of contents. Furthermore, resolving a reference can alter page numbers and shift following text, causing the document to mutate its own dependency graph. Classical attribute grammar pass numbering assumes an invariant graph and cannot be applied to every LaTeX document without verification.</w:t>
+        <w:t>The stopping tests examined in this report do not derive a pass bound from the document's source. A fixed schedule can end before references settle. An engine warning can miss changes to a generated list. Reference text can also change line breaks and page numbers, so a document may alter the dependencies that the analysis tries to describe. Static pass numbering assumes a fixed graph. AuxFlow therefore verifies its predicted plan against an engine run.</w:t>
       </w:r>
     </w:p>
     <w:p>
@@ -497,7 +497,7 @@
           <w:rFonts w:ascii="Calibri" w:hAnsi="Calibri"/>
           <w:sz w:val="22"/>
         </w:rPr>
-        <w:t>Classify a document before the first engine run and name the facts that cause a non-convergent result, with source locations.</w:t>
+        <w:t>Classify a document before an engine run and show the source locations of potentially amplifying cycles.</w:t>
       </w:r>
     </w:p>
     <w:p>
@@ -510,7 +510,7 @@
           <w:rFonts w:ascii="Calibri" w:hAnsi="Calibri"/>
           <w:sz w:val="22"/>
         </w:rPr>
-        <w:t>Derive a run-count bound for documents that can be certified.</w:t>
+        <w:t>Calculate a conservative pass bound when the analysis certifies a document.</w:t>
       </w:r>
     </w:p>
     <w:p>
@@ -523,7 +523,7 @@
           <w:rFonts w:ascii="Calibri" w:hAnsi="Calibri"/>
           <w:sz w:val="22"/>
         </w:rPr>
-        <w:t>Plan the build from the class and verify the result against the real engine.</w:t>
+        <w:t>Build from that classification and compare auxiliary files after each engine run.</w:t>
       </w:r>
     </w:p>
     <w:p>
@@ -536,7 +536,7 @@
           <w:rFonts w:ascii="Calibri" w:hAnsi="Calibri"/>
           <w:sz w:val="22"/>
         </w:rPr>
-        <w:t>Measure the analysis against five deployed stopping tests on a public corpus, including the cases where it fails.</w:t>
+        <w:t>Compare the results with five deployed stopping tests on a 15-document corpus, including cases that expose limitations.</w:t>
       </w:r>
     </w:p>
     <w:p>
@@ -634,7 +634,7 @@
                 <w:b w:val="0"/>
                 <w:sz w:val="18"/>
               </w:rPr>
-              <w:t>Bochmann 1976; Alblas 1981</w:t>
+              <w:t>Bochmann 1976 and Alblas 1981</w:t>
             </w:r>
           </w:p>
         </w:tc>
@@ -650,7 +650,7 @@
                 <w:b w:val="0"/>
                 <w:sz w:val="18"/>
               </w:rPr>
-              <w:t>Static pass numbering for attribute grammars. Alblas separates simple from pure multi-pass evaluation. Minimum pass assignment is NP-complete (Raiha and Ukkonen 1981).</w:t>
+              <w:t>They study how to schedule attribute evaluation across passes. Alblas distinguishes simple and pure multi-pass evaluation. Raiha and Ukkonen (1981) show that finding a minimum pass assignment is NP-complete.</w:t>
             </w:r>
           </w:p>
         </w:tc>
@@ -666,7 +666,7 @@
                 <w:b w:val="0"/>
                 <w:sz w:val="18"/>
               </w:rPr>
-              <w:t>AuxFlow numbers fact instances, which is the pure setting. It computes a conservative bound and makes no minimality claim.</w:t>
+              <w:t>AuxFlow numbers individual facts and calculates a conservative bound. It does not claim the fewest possible passes.</w:t>
             </w:r>
           </w:p>
         </w:tc>
@@ -684,7 +684,7 @@
                 <w:b w:val="0"/>
                 <w:sz w:val="18"/>
               </w:rPr>
-              <w:t>Farrow 1986; Jones 1990; Magnusson and Hedin 2007</w:t>
+              <w:t>Farrow 1986, Jones 1990, Magnusson and Hedin 2007</w:t>
             </w:r>
           </w:p>
         </w:tc>
@@ -700,7 +700,7 @@
                 <w:b w:val="0"/>
                 <w:sz w:val="18"/>
               </w:rPr>
-              <w:t>Circular attribute grammars. Jones splits the dependency graph into strongly connected components. Magnusson and Hedin state the convergence condition (finite height, monotone functions) and note that their evaluator does not check it.</w:t>
+              <w:t>They study circular attribute grammars. Jones uses strongly connected components to separate cycles. Magnusson and Hedin require finite height and monotone functions for convergence, but their evaluator does not check those conditions.</w:t>
             </w:r>
           </w:p>
         </w:tc>
@@ -716,7 +716,7 @@
                 <w:b w:val="0"/>
                 <w:sz w:val="18"/>
               </w:rPr>
-              <w:t>AuxFlow checks the finite-height half in a restricted domain, using a static influence analysis.</w:t>
+              <w:t>AuxFlow uses components to report cycles. Its influence analysis tests a restricted form of the finite-height condition.</w:t>
             </w:r>
           </w:p>
         </w:tc>
@@ -734,7 +734,7 @@
                 <w:b w:val="0"/>
                 <w:sz w:val="18"/>
               </w:rPr>
-              <w:t>Hecht and Ullman 1975; Kam and Ullman 1976</w:t>
+              <w:t>Hecht and Ullman 1975, Kam and Ullman 1976</w:t>
             </w:r>
           </w:p>
         </w:tc>
@@ -750,7 +750,7 @@
                 <w:b w:val="0"/>
                 <w:sz w:val="18"/>
               </w:rPr>
-              <w:t>Iterative data-flow rounds are bounded by a depth parameter of the graph.</w:t>
+              <w:t>They relate iterative data-flow rounds to graph depth.</w:t>
             </w:r>
           </w:p>
         </w:tc>
@@ -766,7 +766,7 @@
                 <w:b w:val="0"/>
                 <w:sz w:val="18"/>
               </w:rPr>
-              <w:t>The AuxFlow plan has the same shape: P runs to propagate, one run to confirm.</w:t>
+              <w:t>AuxFlow uses a similar bound: P runs for propagation and one further run in the static schedule.</w:t>
             </w:r>
           </w:p>
         </w:tc>
@@ -784,7 +784,7 @@
                 <w:b w:val="0"/>
                 <w:sz w:val="18"/>
               </w:rPr>
-              <w:t>Mokhov, Mitchell and Peyton Jones 2018; Erdweg et al. 2015 (Pluto)</w:t>
+              <w:t>Mokhov, Mitchell and Peyton Jones 2018, Erdweg et al. 2015 (Pluto)</w:t>
             </w:r>
           </w:p>
         </w:tc>
@@ -800,7 +800,7 @@
                 <w:b w:val="0"/>
                 <w:sz w:val="18"/>
               </w:rPr>
-              <w:t>Static and dynamic dependencies in build systems. Pluto builds LaTeX with a fixpoint cycle handler and judges static dependency detection for LaTeX to be a lost cause.</w:t>
+              <w:t>These works distinguish static and dynamic dependencies in build systems. Pluto handles LaTeX cycles dynamically and questions whether LaTeX dependencies can be found statically in general.</w:t>
             </w:r>
           </w:p>
         </w:tc>
@@ -816,7 +816,7 @@
                 <w:b w:val="0"/>
                 <w:sz w:val="18"/>
               </w:rPr>
-              <w:t>AuxFlow answers with a declared subset. Constructs outside it become opaque facts and make the document UNKNOWN.</w:t>
+              <w:t>AuxFlow limits the source language. It reports UNKNOWN for unsupported constructs instead of assuming their effects.</w:t>
             </w:r>
           </w:p>
         </w:tc>
@@ -834,7 +834,7 @@
                 <w:b w:val="0"/>
                 <w:sz w:val="18"/>
               </w:rPr>
-              <w:t>latexmk, latexrun, Tectonic, ConTeXt, Typst; Gaspar 2014; Madje 2022</w:t>
+              <w:t>latexmk, latexrun, Tectonic, ConTeXt, Typst, Gaspar 2014, Madje 2022</w:t>
             </w:r>
           </w:p>
         </w:tc>
@@ -850,7 +850,7 @@
                 <w:b w:val="0"/>
                 <w:sz w:val="18"/>
               </w:rPr>
-              <w:t>Five stopping tests and five limits. Gaspar gives a document that never settles. Madje shows the stability test is undecidable for arbitrary code and proposes a cap with an error at the guilty call.</w:t>
+              <w:t>The tools use different stopping tests. Gaspar gives a document that does not settle. Madje discusses why arbitrary program stability is undecidable and proposes a capped check with an error location.</w:t>
             </w:r>
           </w:p>
         </w:tc>
@@ -866,7 +866,7 @@
                 <w:b w:val="0"/>
                 <w:sz w:val="18"/>
               </w:rPr>
-              <w:t>These tools are the baselines. Gaspar's loop is corpus member b08.</w:t>
+              <w:t>The tools supply stopping-test baselines. Gaspar's loop informs corpus member b08.</w:t>
             </w:r>
           </w:p>
         </w:tc>
@@ -883,7 +883,7 @@
           <w:b w:val="0"/>
           <w:sz w:val="22"/>
         </w:rPr>
-        <w:t>AuxFlow adapts established principles from circular attribute grammars, iterative data-flow bounds, and build systems. It introduces an instance-level influence analysis that detects when reference values alter content volume, paired with a controlled empirical comparison of deployed stopping oracles.</w:t>
+        <w:t>The earlier work supplies ways to number passes and analyze cycles, but TeX documents can change their own dependency structure. I used fact instances rather than fact kinds so that the graph records where a particular label, reference, or generated entry comes from. The corpus tests when that model helps and where it misses feedback.</w:t>
       </w:r>
     </w:p>
     <w:p>
@@ -927,7 +927,7 @@
           <w:b w:val="0"/>
           <w:sz w:val="22"/>
         </w:rPr>
-        <w:t>The pipeline has a static part and a dynamic part. Everything up to the build plan runs without a TeX engine. Only auxflow run starts a subprocess.</w:t>
+        <w:t>Parsing, graph construction, classification, and planning use only source files. The auxflow run command executes the plan and checks the files TeX writes.</w:t>
       </w:r>
     </w:p>
     <w:p>
@@ -1007,7 +1007,7 @@
           <w:b w:val="0"/>
           <w:sz w:val="22"/>
         </w:rPr>
-        <w:t>The Auxiliary Reference Graph (ARG) has one node for each fact instance and one edge for each dependency. A fact has a kind, a key, a component (exists or value), and a mandatory source span. An edge has a pass lag, a type (AUX_ROUNDTRIP, TOOL, LAYOUT, or STRUCTURAL), and a reason string.</w:t>
+        <w:t>The Auxiliary Reference Graph (ARG) has a node for each label, reference, or other fact instance. Each node records its kind, key, component (exists or value), and source span. Edges record the dependency, pass lag, reason, and type: AUX_ROUNDTRIP, TOOL, LAYOUT, or STRUCTURAL.</w:t>
       </w:r>
     </w:p>
     <w:p>
@@ -1087,7 +1087,7 @@
           <w:rFonts w:ascii="Calibri" w:hAnsi="Calibri"/>
           <w:sz w:val="22"/>
         </w:rPr>
-        <w:t>Taint analysis seeds the facts that a loop bound or condition reads, then propagates along value edges. Each tainted fact gets a STRUCTURAL edge to the content-volume fact. The cost is O(V + E).</w:t>
+        <w:t>Taint analysis begins with values read in loop bounds or conditions. It follows value edges to find facts that may influence generated content. For each such fact, it adds a STRUCTURAL edge to content volume. The cost is O(V + E).</w:t>
       </w:r>
     </w:p>
     <w:p>
@@ -1100,7 +1100,7 @@
           <w:rFonts w:ascii="Calibri" w:hAnsi="Calibri"/>
           <w:sz w:val="22"/>
         </w:rPr>
-        <w:t>An iterative Tarjan algorithm finds the strongly connected components. A component with an internal STRUCTURAL edge is AMPLIFYING. A component with an opaque fact is UNKNOWN_CYCLE. Any other cycle is BENIGN.</w:t>
+        <w:t>Iterative Tarjan analysis finds strongly connected components. An internal STRUCTURAL edge marks an AMPLIFYING cycle. An opaque fact marks UNKNOWN_CYCLE. The other cycles are BENIGN within the model.</w:t>
       </w:r>
     </w:p>
     <w:p>
@@ -1113,7 +1113,7 @@
           <w:rFonts w:ascii="Calibri" w:hAnsi="Calibri"/>
           <w:sz w:val="22"/>
         </w:rPr>
-        <w:t>Stable-pass numbering follows the longest path on the condensation. For a fact f, s(f) = 1 if f has no dependencies, and otherwise 1 + the largest s(g) + lag(g to f) - 1 over its dependencies g. P is the largest s(f) over facts stored in auxiliary files, and the predicted run count is N = P + 1.</w:t>
+        <w:t>After cycle analysis, stable-pass numbering follows the longest path between components. For a fact f, s(f) = 1 when f has no dependencies. Otherwise, s(f) = 1 + max(s(g) + lag(g to f) - 1) over dependencies g. P is the largest s(f) for facts stored in auxiliary files. The planned bound is N = P + 1.</w:t>
       </w:r>
     </w:p>
     <w:p>
@@ -1193,7 +1193,7 @@
           <w:b w:val="0"/>
           <w:sz w:val="22"/>
         </w:rPr>
-        <w:t>Only a CERTIFIED plan uses the derived run count. Every other executable plan has at least three engine runs, and an assertion in the planner enforces this. An AMPLIFYING document gets no plan unless the user passes --force, which runs it under a cap of six runs.</w:t>
+        <w:t>The classifier selects one of four states from the graph. A CERTIFIED plan uses the derived bound. Every other executable plan starts with at least three engine runs, as enforced by a planner assertion. AMPLIFYING has no plan unless the user supplies --force. That option permits runs up to a cap of six.</w:t>
       </w:r>
     </w:p>
     <w:p>
@@ -1273,7 +1273,7 @@
           <w:b w:val="0"/>
           <w:sz w:val="22"/>
         </w:rPr>
-        <w:t>After each engine run the verifier parses the auxiliary files into a set of canonical records and compares it with the set from the previous run. It does not use engine warnings. If the plan ends while the state still changes, it repeats the last engine step up to the cap and records a prediction miss when a certified document needs more runs than predicted.</w:t>
+        <w:t>After each engine run, the verifier reads auxiliary files and compares canonical records with the previous run. If they still change after the planned runs, it repeats the last engine step up to the cap. It records a prediction miss if verification exceeds a certified bound. It does not use engine rerun warnings.</w:t>
       </w:r>
     </w:p>
     <w:p>
@@ -1353,7 +1353,7 @@
           <w:b w:val="0"/>
           <w:sz w:val="22"/>
         </w:rPr>
-        <w:t>Python 3.12 with no third-party runtime dependencies. pytest and Hypothesis for tests, ruff and mypy --strict for quality checks, Docker for the pinned benchmark image, and hatch-vcs for versioning from git tags.</w:t>
+        <w:t>The compiler core uses Python 3.12 without third-party runtime dependencies. I used pytest and Hypothesis for tests, ruff and mypy --strict for checks, Docker for the pinned benchmark image, and hatch-vcs for tag-based versions.</w:t>
       </w:r>
     </w:p>
     <w:p>
@@ -1383,7 +1383,7 @@
           <w:b w:val="0"/>
           <w:sz w:val="22"/>
         </w:rPr>
-        <w:t>The project was built in 16 phases. Review 2 covered phases 1 to 7 (lexer, parser, syntax tree, symbol tables, semantic checks, and the ARG). This review covers phases 8 to 16.</w:t>
+        <w:t>Review 2 covered phases 1 to 7, from lexical analysis through ARG construction. Phases 8 to 16 add graph analysis, planning, runtime checks, and evaluation.</w:t>
       </w:r>
     </w:p>
     <w:tbl>
@@ -1827,7 +1827,7 @@
           <w:rFonts w:ascii="Calibri" w:hAnsi="Calibri"/>
           <w:sz w:val="22"/>
         </w:rPr>
-        <w:t>A guard makes a page reference under roman, Roman, alph, or Alph page numbering UNKNOWN, because the numeral width depends on its value. \vref and \vpageref also make a document UNKNOWN.</w:t>
+        <w:t>After the first measurements, I added a guard for page references under roman, Roman, alph, or Alph numbering. These numeral forms can change width as their values change. The guard also marks \vref and \vpageref UNKNOWN.</w:t>
       </w:r>
     </w:p>
     <w:p>
@@ -1840,7 +1840,7 @@
           <w:rFonts w:ascii="Calibri" w:hAnsi="Calibri"/>
           <w:sz w:val="22"/>
         </w:rPr>
-        <w:t>A list of inert packages and commands keeps ordinary front matter from making a document UNKNOWN.</w:t>
+        <w:t>An explicit list treats certain packages and commands as inert. This lets ordinary front matter pass without treating an arbitrary package as safe.</w:t>
       </w:r>
     </w:p>
     <w:p>
@@ -1853,7 +1853,7 @@
           <w:rFonts w:ascii="Calibri" w:hAnsi="Calibri"/>
           <w:sz w:val="22"/>
         </w:rPr>
-        <w:t>auxflow run limits each tool call to 600 seconds, passes -no-shell-escape, and rejects auxiliary files outside the work directory.</w:t>
+        <w:t>The auxflow run command limits each tool call to 600 seconds. It passes -no-shell-escape and rejects auxiliary files outside the work directory.</w:t>
       </w:r>
     </w:p>
     <w:p>
@@ -1866,7 +1866,7 @@
           <w:rFonts w:ascii="Calibri" w:hAnsi="Calibri"/>
           <w:sz w:val="22"/>
         </w:rPr>
-        <w:t>auxflow update uses pipx when the environment has no pip.</w:t>
+        <w:t>The auxflow update command uses pipx when that environment has no pip.</w:t>
       </w:r>
     </w:p>
     <w:p>
@@ -1893,7 +1893,7 @@
           <w:rFonts w:ascii="Calibri" w:hAnsi="Calibri"/>
           <w:sz w:val="22"/>
         </w:rPr>
-        <w:t>5,602 lines of Python source code in 47 modules and 5,893 lines of test code in 57 test files. No third-party runtime dependencies.</w:t>
+        <w:t>At the review snapshot, the project had 5,602 lines of Python source code in 47 modules and 5,893 lines of test code in 57 test files. The compiler core had no third-party runtime dependencies.</w:t>
       </w:r>
     </w:p>
     <w:p>
@@ -1906,7 +1906,7 @@
           <w:rFonts w:ascii="Calibri" w:hAnsi="Calibri"/>
           <w:sz w:val="22"/>
         </w:rPr>
-        <w:t>396 unit, golden, and property tests pass (1 skipped). mypy --strict passes with zero issues on 48 files. ruff lint and format checks are clean.</w:t>
+        <w:t>At that snapshot, 396 unit, golden, and property tests passed (1 skipped). mypy --strict reported zero issues on 48 files. ruff lint and format checks were clean.</w:t>
       </w:r>
     </w:p>
     <w:p>
@@ -2162,7 +2162,7 @@
           <w:b w:val="0"/>
           <w:sz w:val="22"/>
         </w:rPr>
-        <w:t>The corpus has 15 documents (b01_plain to b15_ibid) that cover the non-convergence mechanisms M1 to M9, including a multi-chapter thesis. Seven baselines ran ten times on each document, one container per repetition, with one CPU and no network: 1,050 runs. A is a fixed three-run schedule, B the rerun warning, C output comparison, C' input comparison, C'' read-then-written comparison, D AuxFlow static analysis, and E AuxFlow with runtime verification. Ground truth N* comes from eight unconditional engine passes and is independent of every baseline. The expected class of each document was written before the analyzer.</w:t>
+        <w:t>The 15 documents, b01_plain through b15_ibid, include a multi-chapter thesis and cases for mechanisms M1 to M9. Each of seven baselines used ten repetitions per document, in separate containers with one CPU and no network. This produced 1,050 runs. A is a fixed three-run schedule, B uses engine warnings, C compares outputs, C' compares inputs, and C'' compares files read and rewritten within a run. D is static AuxFlow analysis. E adds runtime verification. Ground truth N* uses eight unconditional engine passes rather than a baseline's stopping decision. I recorded the expected classes before implementing the analyzer.</w:t>
       </w:r>
     </w:p>
     <w:p>
@@ -3575,7 +3575,7 @@
           <w:rFonts w:ascii="Calibri" w:hAnsi="Calibri"/>
           <w:sz w:val="22"/>
         </w:rPr>
-        <w:t>All 7 certified documents satisfy N &gt;= N*. The bound is exact for 4 and larger by one for 3 (b04, b06, b09). No bound is too small.</w:t>
+        <w:t>For the 7 currently certified documents, N &gt;= N*. The bound is exact for 4 and exceeds ground truth by one for b04, b06, and b09. This is a conservative bound, not a minimum pass count.</w:t>
       </w:r>
     </w:p>
     <w:p>
@@ -3588,7 +3588,7 @@
           <w:rFonts w:ascii="Calibri" w:hAnsi="Calibri"/>
           <w:sz w:val="22"/>
         </w:rPr>
-        <w:t>b08 is AMPLIFYING and b05 is not. These two checks guard against an analysis that says nothing, and both pass.</w:t>
+        <w:t>The classifier marks b08 AMPLIFYING and b05 CERTIFIED. The former has a content-generating cycle, while the latter has a generated list without that cycle.</w:t>
       </w:r>
     </w:p>
     <w:p>
@@ -3601,7 +3601,7 @@
           <w:rFonts w:ascii="Calibri" w:hAnsi="Calibri"/>
           <w:sz w:val="22"/>
         </w:rPr>
-        <w:t>All 6 non-convergent documents are flagged before the engine starts: 2 AMPLIFYING and 4 UNKNOWN. None is certified.</w:t>
+        <w:t>Among the 6 non-convergent corpus documents, 2 are AMPLIFYING and 4 are UNKNOWN before execution. UNKNOWN reports insufficient static knowledge, not proof of non-convergence. Ground truth supplies the latter finding.</w:t>
       </w:r>
     </w:p>
     <w:p>
@@ -3614,7 +3614,7 @@
           <w:rFonts w:ascii="Calibri" w:hAnsi="Calibri"/>
           <w:sz w:val="22"/>
         </w:rPr>
-        <w:t>b14 is AMPLIFYING by over-approximation. Nothing in it changes the quantity of content, only its size. Typst compiles the ported document without an error.</w:t>
+        <w:t>The analysis marks b14 AMPLIFYING because it may affect content quantity. This case changes content size instead. A hand port compiled under Typst without an error.</w:t>
       </w:r>
     </w:p>
     <w:p>
@@ -3641,7 +3641,7 @@
           <w:b w:val="0"/>
           <w:sz w:val="22"/>
         </w:rPr>
-        <w:t>In the pre-registered test specification, documents b11, b12, and b13 were declared false negatives with expected classification CERTIFIED. The syntactic guards introduced in phase 16 reclassified all three documents as UNKNOWN. Consequently, the automated verification report flags Gate 1 as FAIL against the original baseline specification. Gate 2 (N &gt;= N* across all certified inputs) passes with zero violations. Because the width guards were implemented following initial measurements, this corpus does not constitute an independent validation of the rule, which targets numeral syntax rather than underlying font metrics.</w:t>
+        <w:t>The original test specification expected CERTIFIED for b11, b12, and b13, although it identified them as false negatives. After initial measurements, the phase 16 syntactic guards changed all three to UNKNOWN. The automated report therefore marks Gate 1 FAIL against that original specification. Gate 2 checks N &gt;= N* for certified documents and reports zero violations. These three cases cannot independently validate a guard designed after their failures. The guard checks numeral syntax, not font metrics.</w:t>
       </w:r>
     </w:p>
     <w:p>
@@ -4605,7 +4605,7 @@
           <w:rFonts w:ascii="Calibri" w:hAnsi="Calibri"/>
           <w:sz w:val="22"/>
         </w:rPr>
-        <w:t>Baseline A accepts all six non-convergent documents after three runs.</w:t>
+        <w:t>The fixed three-run schedule A accepts all 6 non-convergent cases as converged.</w:t>
       </w:r>
     </w:p>
     <w:p>
@@ -4618,7 +4618,7 @@
           <w:rFonts w:ascii="Calibri" w:hAnsi="Calibri"/>
           <w:sz w:val="22"/>
         </w:rPr>
-        <w:t>Baseline B is unsound in both directions. It accepts b10 after one run in all ten repetitions, although b10 never settles. It stops after one run on b05 and b15, where N* is 3.</w:t>
+        <w:t>The warning test B accepts b10 after one run in every repetition, although its auxiliary state never settles. B also stops at one run on b05 and b15, where N* is 3.</w:t>
       </w:r>
     </w:p>
     <w:p>
@@ -4631,7 +4631,7 @@
           <w:rFonts w:ascii="Calibri" w:hAnsi="Calibri"/>
           <w:sz w:val="22"/>
         </w:rPr>
-        <w:t>C, C', and C'' agree on every document. The expected one-run gap between output comparison and input comparison did not appear on this corpus.</w:t>
+        <w:t>C, C', and C'' produced the same outcomes for each document. The expected one-run difference between output and input comparisons did not appear in this corpus.</w:t>
       </w:r>
     </w:p>
     <w:p>
@@ -4644,7 +4644,7 @@
           <w:rFonts w:ascii="Calibri" w:hAnsi="Calibri"/>
           <w:sz w:val="22"/>
         </w:rPr>
-        <w:t>E spends 17 runs on the 7 documents it executes, against 21 for A on the same documents. It refuses 8 documents before the first run: the 6 non-convergent ones, and b07 and b15, which contain opaque constructs.</w:t>
+        <w:t>E made 17 engine runs across the 7 convergent documents it executed. A made 21 on those same documents. E refused the 6 non-convergent cases and the convergent but opaque b07 and b15 before an engine run.</w:t>
       </w:r>
     </w:p>
     <w:p>
@@ -4657,7 +4657,7 @@
           <w:rFonts w:ascii="Calibri" w:hAnsi="Calibri"/>
           <w:sz w:val="22"/>
         </w:rPr>
-        <w:t>b01_plain needs two runs under E although N* is 1. pdfTeX writes a page-count record to every .aux file, so the verifier needs a second run to see two equal states. It records a prediction miss in all ten repetitions. The prediction is right.</w:t>
+        <w:t>For b01_plain, N* and the predicted N are both 1, but E runs twice. pdfTeX writes a page-count record to the .aux file, so the verifier needs two observed states to confirm equality. It records a prediction miss in all 10 repetitions because the executed count exceeds N. That operational miss does not show a pass-bound violation.</w:t>
       </w:r>
     </w:p>
     <w:p>
@@ -4737,7 +4737,7 @@
           <w:b w:val="0"/>
           <w:sz w:val="22"/>
         </w:rPr>
-        <w:t>latexmk and latexrun fail to converge on all six non-convergent documents, so these documents are real non-convergence and not artifacts of the corpus. latexrun also fails on b15, which latexmk accepts. Tectonic compiled only b01 and b08 offline. On b08 it stops at its limit of six passes. Typst rejects a hand port of b08 with 'loop seems to be infinite'.</w:t>
+        <w:t>latexmk and latexrun did not converge on the 6 non-convergent documents within their tested limits. latexrun also failed on b15, which latexmk accepted. Offline Tectonic ran only b01 and b08. It reached its six-pass limit on b08. Typst rejected a hand port of b08 with 'loop seems to be infinite'.</w:t>
       </w:r>
     </w:p>
     <w:p>
@@ -4764,7 +4764,7 @@
           <w:b w:val="0"/>
           <w:sz w:val="22"/>
         </w:rPr>
-        <w:t>Static analysis takes 1.3 ms at the median and 10.4 ms at most. The largest graph is b09_thesis with 91 facts and 73 edges, at 7.5 ms. This time is reported as overhead and is not subtracted from any run time.</w:t>
+        <w:t>The analysis took 1.3 ms at the median and 10.4 ms at most across the measured corpus. The largest graph, b09_thesis, had 91 facts and 73 edges and took 7.5 ms. These timings are analysis overhead. The run counts above do not subtract that time.</w:t>
       </w:r>
     </w:p>
     <w:p>
@@ -4791,7 +4791,7 @@
           <w:rFonts w:ascii="Calibri" w:hAnsi="Calibri"/>
           <w:sz w:val="22"/>
         </w:rPr>
-        <w:t>The corpus has 15 documents and most are synthetic. All runs used one machine.</w:t>
+        <w:t>The corpus contains 15 documents, mostly synthetic, and all benchmark runs used one machine. This limits how far the findings generalize.</w:t>
       </w:r>
     </w:p>
     <w:p>
@@ -4804,7 +4804,7 @@
           <w:rFonts w:ascii="Calibri" w:hAnsi="Calibri"/>
           <w:sz w:val="22"/>
         </w:rPr>
-        <w:t>One person wrote the corpus, the expectations, and the analyzer. The expectations came first and are in the repository.</w:t>
+        <w:t>I wrote the corpus, expectations, and analyzer. I recorded the expectations first, but their author and the implementer were the same person.</w:t>
       </w:r>
     </w:p>
     <w:p>
@@ -4817,7 +4817,7 @@
           <w:rFonts w:ascii="Calibri" w:hAnsi="Calibri"/>
           <w:sz w:val="22"/>
         </w:rPr>
-        <w:t>The model assumes that resolving a reference does not change pagination. This is false in general, and the analysis is unsound for the extent-driven class.</w:t>
+        <w:t>The model assumes a resolved reference does not change pagination. Text width can violate that assumption, so the analysis remains unsound for extent-driven feedback.</w:t>
       </w:r>
     </w:p>
     <w:p>
@@ -4830,7 +4830,7 @@
           <w:rFonts w:ascii="Calibri" w:hAnsi="Calibri"/>
           <w:sz w:val="22"/>
         </w:rPr>
-        <w:t>The container holds TeX Live 2022. Run counts may differ on other releases. A leftover .aux file in a corpus directory once made three baselines stop early on b05. Those records were removed and run again.</w:t>
+        <w:t>The container uses TeX Live 2022. Other releases may require different run counts. A leftover .aux file once caused three baselines to stop early on b05. I removed those records and repeated the runs.</w:t>
       </w:r>
     </w:p>
     <w:p>
@@ -4874,7 +4874,7 @@
           <w:rFonts w:ascii="Calibri" w:hAnsi="Calibri"/>
           <w:sz w:val="22"/>
         </w:rPr>
-        <w:t>AuxFlow statically determines compilation pass bounds and isolates non-convergence prior to engine execution.</w:t>
+        <w:t>On the 7 currently certified documents, AuxFlow's bound was never below the measured N*. The planner uses a conservative schedule for documents it cannot certify.</w:t>
       </w:r>
     </w:p>
     <w:p>
@@ -4887,7 +4887,7 @@
           <w:rFonts w:ascii="Calibri" w:hAnsi="Calibri"/>
           <w:sz w:val="22"/>
         </w:rPr>
-        <w:t>Static analysis operates with negligible latency (1.3 ms median), providing upfront diagnostics with source spans.</w:t>
+        <w:t>Static analysis took 1.3 ms at the median in this 15-document corpus. Diagnostics include source locations.</w:t>
       </w:r>
     </w:p>
     <w:p>
@@ -4900,7 +4900,7 @@
           <w:rFonts w:ascii="Calibri" w:hAnsi="Calibri"/>
           <w:sz w:val="22"/>
         </w:rPr>
-        <w:t>Empirical benchmarks demonstrate where existing oracles fail: fixed schedules miss instability, and rerun warnings terminate prematurely on unindexed list changes.</w:t>
+        <w:t>In this corpus, a fixed three-run schedule accepted all 6 unstable documents, while the engine-warning test stopped early on b05 and b15. It also accepted b10 as converged.</w:t>
       </w:r>
     </w:p>
     <w:p>
@@ -4913,7 +4913,7 @@
           <w:rFonts w:ascii="Calibri" w:hAnsi="Calibri"/>
           <w:sz w:val="22"/>
         </w:rPr>
-        <w:t>The research paper has been written and formatted in IEEE conference style in paper/.</w:t>
+        <w:t>The IEEE conference-style research paper is in paper/.</w:t>
       </w:r>
     </w:p>
     <w:p>
@@ -4940,7 +4940,7 @@
           <w:rFonts w:ascii="Calibri" w:hAnsi="Calibri"/>
           <w:sz w:val="22"/>
         </w:rPr>
-        <w:t>The analysis covers a declared subset. Anything outside it makes a document UNKNOWN.</w:t>
+        <w:t>The analysis handles a declared subset. Unsupported constructs make the result UNKNOWN, which is not a non-convergence finding.</w:t>
       </w:r>
     </w:p>
     <w:p>
@@ -4953,7 +4953,7 @@
           <w:rFonts w:ascii="Calibri" w:hAnsi="Calibri"/>
           <w:sz w:val="22"/>
         </w:rPr>
-        <w:t>It cannot see most extent-driven feedback. The width guard is syntactic.</w:t>
+        <w:t>The syntactic width guard does not capture every change to text extent. Extent-driven feedback can still defeat the analysis.</w:t>
       </w:r>
     </w:p>
     <w:p>
@@ -4966,7 +4966,7 @@
           <w:rFonts w:ascii="Calibri" w:hAnsi="Calibri"/>
           <w:sz w:val="22"/>
         </w:rPr>
-        <w:t>The AMPLIFYING label joins divergence and oscillation. The bound for a benign cycle is a heuristic, and the corpus has no benign cyclic member.</w:t>
+        <w:t>AMPLIFYING covers both divergence and oscillation. The bound for BENIGN_CYCLIC is heuristic, and this corpus has no benign cyclic case.</w:t>
       </w:r>
     </w:p>
     <w:p>
@@ -4993,7 +4993,7 @@
           <w:rFonts w:ascii="Calibri" w:hAnsi="Calibri"/>
           <w:sz w:val="22"/>
         </w:rPr>
-        <w:t>Test on a larger set of real documents.</w:t>
+        <w:t>Test more documents from independent, real projects.</w:t>
       </w:r>
     </w:p>
     <w:p>
@@ -5006,7 +5006,7 @@
           <w:rFonts w:ascii="Calibri" w:hAnsi="Calibri"/>
           <w:sz w:val="22"/>
         </w:rPr>
-        <w:t>Replace the syntactic width guard with a test that does not depend on syntax.</w:t>
+        <w:t>Develop a width analysis that does not rely only on numeral syntax.</w:t>
       </w:r>
     </w:p>
     <w:p>
@@ -5019,7 +5019,7 @@
           <w:rFonts w:ascii="Calibri" w:hAnsi="Calibri"/>
           <w:sz w:val="22"/>
         </w:rPr>
-        <w:t>Split AMPLIFYING into divergent and oscillating cases.</w:t>
+        <w:t>Distinguish divergent cycles from oscillating cycles where evidence permits.</w:t>
       </w:r>
     </w:p>
     <w:p>
@@ -5032,7 +5032,7 @@
           <w:rFonts w:ascii="Calibri" w:hAnsi="Calibri"/>
           <w:sz w:val="22"/>
         </w:rPr>
-        <w:t>Model more packages, so fewer documents are UNKNOWN, and prove a bound for benign cycles.</w:t>
+        <w:t>Model additional package behavior and study whether benign cycles admit a justified pass bound.</w:t>
       </w:r>
     </w:p>
     <w:p>

</xml_diff>